<commit_message>
Add credits and trademark page to booklet PDF; scrub metadata
The downloadable booklet PDF was an older career-day version
missing attribution. It now carries a credits page matching the
web booklet credits.md: CC BY-NC 4.0 license, Mosey and Wobble
trademark notice, Wreck-It Ralph / Disney acknowledgment, the
"formerly Boop" lineage note, and a per-page copyright footer.
Cover title shows Mosey and Wobble trademark marks on first use.

Author metadata stripped from both the PDF (info dictionary and
XMP packet) and the source docx (creator, lastModifiedBy), per
the academy institutional-byline rule. Verified clean.

Co-Authored-By: Claude Opus 4.8 (1M context) <noreply@anthropic.com>
</commit_message>
<xml_diff>
--- a/assets/mosey-and-wobble-meet.docx
+++ b/assets/mosey-and-wobble-meet.docx
@@ -11,12 +11,52 @@
     <w:p>
       <w:pPr>
         <w:pStyle w:val="Title"/>
-      </w:pPr>
-      <w:r>
-        <w:t xml:space="preserve">Mosey </w:t>
-      </w:r>
-      <w:r>
+        <w:rPr>
+          <w:i/>
+          <w:iCs/>
+        </w:rPr>
+      </w:pPr>
+      <w:r>
+        <w:rPr>
+          <w:i/>
+          <w:iCs/>
+        </w:rPr>
+        <w:t>Mosey</w:t>
+      </w:r>
+      <w:r>
+        <w:rPr>
+          <w:i/>
+          <w:iCs/>
+        </w:rPr>
+        <w:t>™</w:t>
+      </w:r>
+      <w:r>
+        <w:rPr>
+          <w:i/>
+          <w:iCs/>
+        </w:rPr>
+        <w:t xml:space="preserve"> </w:t>
+      </w:r>
+      <w:r>
+        <w:rPr>
+          <w:i/>
+          <w:iCs/>
+        </w:rPr>
         <w:t>and Wobble</w:t>
+      </w:r>
+      <w:r>
+        <w:rPr>
+          <w:i/>
+          <w:iCs/>
+        </w:rPr>
+        <w:t>™</w:t>
+      </w:r>
+      <w:r>
+        <w:rPr>
+          <w:i/>
+          <w:iCs/>
+        </w:rPr>
+        <w:t xml:space="preserve"> Meet</w:t>
       </w:r>
     </w:p>
     <w:p>
@@ -57,7 +97,7 @@
                     </pic:cNvPicPr>
                   </pic:nvPicPr>
                   <pic:blipFill>
-                    <a:blip r:embed="rId5">
+                    <a:blip r:embed="rId7">
                       <a:extLst>
                         <a:ext uri="{28A0092B-C50C-407E-A947-70E740481C1C}">
                           <a14:useLocalDpi xmlns:a14="http://schemas.microsoft.com/office/drawing/2010/main" val="0"/>
@@ -579,7 +619,16 @@
     <w:p/>
     <w:p/>
     <w:p/>
-    <w:p/>
+    <w:p>
+      <w:pPr>
+        <w:tabs>
+          <w:tab w:val="left" w:pos="2976"/>
+        </w:tabs>
+      </w:pPr>
+      <w:r>
+        <w:tab/>
+      </w:r>
+    </w:p>
     <w:p>
       <w:pPr>
         <w:rPr>
@@ -4707,7 +4756,7 @@
       <w:r>
         <w:t> (</w:t>
       </w:r>
-      <w:hyperlink r:id="rId6" w:tgtFrame="_blank" w:history="1">
+      <w:hyperlink r:id="rId8" w:tgtFrame="_blank" w:history="1">
         <w:r>
           <w:rPr>
             <w:rStyle w:val="Hyperlink"/>
@@ -4732,7 +4781,7 @@
           <w:numId w:val="11"/>
         </w:numPr>
       </w:pPr>
-      <w:hyperlink r:id="rId7" w:tgtFrame="_blank" w:history="1">
+      <w:hyperlink r:id="rId9" w:tgtFrame="_blank" w:history="1">
         <w:r>
           <w:rPr>
             <w:rStyle w:val="Hyperlink"/>
@@ -4865,39 +4914,303 @@
       </w:r>
     </w:p>
     <w:p>
+      <w:pPr>
+        <w:rPr>
+          <w:rFonts w:ascii="Patrick Hand" w:eastAsiaTheme="majorEastAsia" w:hAnsi="Patrick Hand" w:cstheme="majorBidi"/>
+          <w:color w:val="0F4761" w:themeColor="accent1" w:themeShade="BF"/>
+          <w:sz w:val="56"/>
+          <w:szCs w:val="40"/>
+        </w:rPr>
+      </w:pPr>
       <w:r>
         <w:t>What's yours?</w:t>
       </w:r>
-    </w:p>
-    <w:p/>
-    <w:p/>
-    <w:p/>
-    <w:p/>
-    <w:p/>
-    <w:p/>
-    <w:p>
-      <w:pPr>
-        <w:rPr>
-          <w:sz w:val="20"/>
-          <w:szCs w:val="20"/>
-        </w:rPr>
-      </w:pPr>
-      <w:r>
-        <w:rPr>
-          <w:sz w:val="20"/>
-          <w:szCs w:val="20"/>
-        </w:rPr>
-        <w:t>Copyright © Immersive Fusion LLC</w:t>
+      <w:r>
+        <w:br w:type="page"/>
+      </w:r>
+    </w:p>
+    <w:p>
+      <w:pPr>
+        <w:rPr>
+          <w:rFonts w:ascii="Patrick Hand" w:eastAsiaTheme="majorEastAsia" w:hAnsi="Patrick Hand" w:cstheme="majorBidi"/>
+          <w:color w:val="0F4761" w:themeColor="accent1" w:themeShade="BF"/>
+          <w:sz w:val="56"/>
+          <w:szCs w:val="40"/>
+        </w:rPr>
+      </w:pPr>
+      <w:r>
+        <w:rPr>
+          <w:rFonts w:ascii="Patrick Hand" w:eastAsiaTheme="majorEastAsia" w:hAnsi="Patrick Hand" w:cstheme="majorBidi"/>
+          <w:color w:val="0F4761" w:themeColor="accent1" w:themeShade="BF"/>
+          <w:sz w:val="56"/>
+          <w:szCs w:val="40"/>
+        </w:rPr>
+        <w:lastRenderedPageBreak/>
+        <w:t>Credits and acknowledgments</w:t>
+      </w:r>
+    </w:p>
+    <w:p>
+      <w:pPr>
+        <w:rPr>
+          <w:szCs w:val="28"/>
+        </w:rPr>
+      </w:pPr>
+      <w:r>
+        <w:rPr>
+          <w:i/>
+          <w:iCs/>
+          <w:szCs w:val="28"/>
+        </w:rPr>
+        <w:t>Mosey and Wobble Meet</w:t>
+      </w:r>
+      <w:r>
+        <w:rPr>
+          <w:szCs w:val="28"/>
+        </w:rPr>
+        <w:t xml:space="preserve"> is published by Immersive Fusion LLC under the Creative Commons Attribution-</w:t>
+      </w:r>
+      <w:proofErr w:type="spellStart"/>
+      <w:r>
+        <w:rPr>
+          <w:szCs w:val="28"/>
+        </w:rPr>
+        <w:t>NonCommercial</w:t>
+      </w:r>
+      <w:proofErr w:type="spellEnd"/>
+      <w:r>
+        <w:rPr>
+          <w:szCs w:val="28"/>
+        </w:rPr>
+        <w:t xml:space="preserve"> 4.0 International license (CC BY-NC 4.0). You may copy, print, translate, and share this work for non-commercial purposes, including in classrooms, with attribution to Immersive Fusion. The full license is at creativecommons.org/licenses/by-</w:t>
+      </w:r>
+      <w:proofErr w:type="spellStart"/>
+      <w:r>
+        <w:rPr>
+          <w:szCs w:val="28"/>
+        </w:rPr>
+        <w:t>nc</w:t>
+      </w:r>
+      <w:proofErr w:type="spellEnd"/>
+      <w:r>
+        <w:rPr>
+          <w:szCs w:val="28"/>
+        </w:rPr>
+        <w:t>/4.0/.</w:t>
+      </w:r>
+    </w:p>
+    <w:p>
+      <w:pPr>
+        <w:rPr>
+          <w:rStyle w:val="Heading2Char"/>
+          <w:sz w:val="28"/>
+          <w:szCs w:val="28"/>
+        </w:rPr>
+      </w:pPr>
+      <w:r>
+        <w:rPr>
+          <w:rStyle w:val="Heading2Char"/>
+          <w:sz w:val="28"/>
+          <w:szCs w:val="28"/>
+        </w:rPr>
+        <w:t>Names and trademarks</w:t>
+      </w:r>
+    </w:p>
+    <w:p>
+      <w:pPr>
+        <w:rPr>
+          <w:szCs w:val="28"/>
+        </w:rPr>
+      </w:pPr>
+      <w:r>
+        <w:rPr>
+          <w:szCs w:val="28"/>
+        </w:rPr>
+        <w:t>Mosey and Wobble are trademarks of Immersive Fusion LLC.</w:t>
+      </w:r>
+    </w:p>
+    <w:p>
+      <w:pPr>
+        <w:rPr>
+          <w:szCs w:val="28"/>
+        </w:rPr>
+      </w:pPr>
+      <w:r>
+        <w:rPr>
+          <w:szCs w:val="28"/>
+        </w:rPr>
+        <w:t>This character started life with a different name: Boop. We changed it to Mosey because "Boop" turned out to be too close to names other people already use. We are telling you that here, on the record, rather than quietly swapping the name and pretending the first one never happened. If you read an earlier version that called him Boop, it was the same little robot.</w:t>
+      </w:r>
+    </w:p>
+    <w:p>
+      <w:pPr>
+        <w:rPr>
+          <w:szCs w:val="28"/>
+        </w:rPr>
+      </w:pPr>
+      <w:r>
+        <w:rPr>
+          <w:rStyle w:val="Heading2Char"/>
+          <w:sz w:val="28"/>
+          <w:szCs w:val="28"/>
+        </w:rPr>
+        <w:t>Acknowledgments</w:t>
+      </w:r>
+    </w:p>
+    <w:p>
+      <w:pPr>
+        <w:rPr>
+          <w:szCs w:val="28"/>
+        </w:rPr>
+      </w:pPr>
+      <w:r>
+        <w:rPr>
+          <w:szCs w:val="28"/>
+        </w:rPr>
+        <w:t xml:space="preserve">This booklet references </w:t>
+      </w:r>
+      <w:r>
+        <w:rPr>
+          <w:i/>
+          <w:iCs/>
+          <w:szCs w:val="28"/>
+        </w:rPr>
+        <w:t>Wreck-It Ralph</w:t>
+      </w:r>
+      <w:r>
+        <w:rPr>
+          <w:szCs w:val="28"/>
+        </w:rPr>
+        <w:t>, the 2012 animated film and its characters Ralph and Felix, as a frame for explaining the relationship between people who build things and people who try to break things on purpose. The reference is used for commentary and educational illustration only.</w:t>
+      </w:r>
+    </w:p>
+    <w:p>
+      <w:pPr>
+        <w:rPr>
+          <w:szCs w:val="28"/>
+        </w:rPr>
+      </w:pPr>
+      <w:r>
+        <w:rPr>
+          <w:b/>
+          <w:bCs/>
+          <w:szCs w:val="28"/>
+        </w:rPr>
+        <w:t>Wreck-It Ralph, Ralph, Fix-It Felix Jr., and related characters are trademarks of The Walt Disney Company.</w:t>
+      </w:r>
+      <w:r>
+        <w:rPr>
+          <w:szCs w:val="28"/>
+        </w:rPr>
+        <w:t xml:space="preserve"> This publication is an independent educational work. It is not affiliated with, sponsored by, endorsed by, or otherwise connected to The Walt Disney Company or its subsidiaries.</w:t>
+      </w:r>
+    </w:p>
+    <w:p>
+      <w:pPr>
+        <w:rPr>
+          <w:rStyle w:val="Heading2Char"/>
+          <w:sz w:val="28"/>
+          <w:szCs w:val="28"/>
+        </w:rPr>
+      </w:pPr>
+      <w:r>
+        <w:rPr>
+          <w:rStyle w:val="Heading2Char"/>
+          <w:sz w:val="28"/>
+          <w:szCs w:val="28"/>
+        </w:rPr>
+        <w:t>A note on the voice</w:t>
+      </w:r>
+    </w:p>
+    <w:p>
+      <w:r>
+        <w:rPr>
+          <w:szCs w:val="28"/>
+        </w:rPr>
+        <w:t>The writing follows three posture references: Fred Rogers (welcoming, calm), Mo Willems (deadpan, brief, character-forward), and Bob Ross (permission to try, gentleness about hard things). None of them are credited as collaborators, because none of them are. They are the posture targets the writing aims at.</w:t>
       </w:r>
     </w:p>
     <w:sectPr>
+      <w:footerReference w:type="default" r:id="rId10"/>
       <w:pgSz w:w="12240" w:h="15840" w:code="1"/>
-      <w:pgMar w:top="720" w:right="720" w:bottom="720" w:left="720" w:header="720" w:footer="720" w:gutter="432"/>
+      <w:pgMar w:top="720" w:right="720" w:bottom="720" w:left="720" w:header="720" w:footer="0" w:gutter="432"/>
       <w:cols w:space="720"/>
-      <w:docGrid w:linePitch="360"/>
+      <w:docGrid w:linePitch="381"/>
     </w:sectPr>
   </w:body>
 </w:document>
+</file>
+
+<file path=word/endnotes.xml><?xml version="1.0" encoding="utf-8"?>
+<w:endnotes xmlns:wpc="http://schemas.microsoft.com/office/word/2010/wordprocessingCanvas" xmlns:cx="http://schemas.microsoft.com/office/drawing/2014/chartex" xmlns:cx1="http://schemas.microsoft.com/office/drawing/2015/9/8/chartex" xmlns:cx2="http://schemas.microsoft.com/office/drawing/2015/10/21/chartex" xmlns:cx3="http://schemas.microsoft.com/office/drawing/2016/5/9/chartex" xmlns:cx4="http://schemas.microsoft.com/office/drawing/2016/5/10/chartex" xmlns:cx5="http://schemas.microsoft.com/office/drawing/2016/5/11/chartex" xmlns:cx6="http://schemas.microsoft.com/office/drawing/2016/5/12/chartex" xmlns:cx7="http://schemas.microsoft.com/office/drawing/2016/5/13/chartex" xmlns:cx8="http://schemas.microsoft.com/office/drawing/2016/5/14/chartex" xmlns:mc="http://schemas.openxmlformats.org/markup-compatibility/2006" xmlns:aink="http://schemas.microsoft.com/office/drawing/2016/ink" xmlns:am3d="http://schemas.microsoft.com/office/drawing/2017/model3d" xmlns:o="urn:schemas-microsoft-com:office:office" xmlns:oel="http://schemas.microsoft.com/office/2019/extlst" xmlns:r="http://schemas.openxmlformats.org/officeDocument/2006/relationships" xmlns:m="http://schemas.openxmlformats.org/officeDocument/2006/math" xmlns:v="urn:schemas-microsoft-com:vml" xmlns:wp14="http://schemas.microsoft.com/office/word/2010/wordprocessingDrawing" xmlns:wp="http://schemas.openxmlformats.org/drawingml/2006/wordprocessingDrawing" xmlns:w10="urn:schemas-microsoft-com:office:word" xmlns:w="http://schemas.openxmlformats.org/wordprocessingml/2006/main" xmlns:w14="http://schemas.microsoft.com/office/word/2010/wordml" xmlns:w15="http://schemas.microsoft.com/office/word/2012/wordml" xmlns:w16cex="http://schemas.microsoft.com/office/word/2018/wordml/cex" xmlns:w16cid="http://schemas.microsoft.com/office/word/2016/wordml/cid" xmlns:w16="http://schemas.microsoft.com/office/word/2018/wordml" xmlns:w16du="http://schemas.microsoft.com/office/word/2023/wordml/word16du" xmlns:w16sdtdh="http://schemas.microsoft.com/office/word/2020/wordml/sdtdatahash" xmlns:w16sdtfl="http://schemas.microsoft.com/office/word/2024/wordml/sdtformatlock" xmlns:w16se="http://schemas.microsoft.com/office/word/2015/wordml/symex" xmlns:wpg="http://schemas.microsoft.com/office/word/2010/wordprocessingGroup" xmlns:wpi="http://schemas.microsoft.com/office/word/2010/wordprocessingInk" xmlns:wne="http://schemas.microsoft.com/office/word/2006/wordml" xmlns:wps="http://schemas.microsoft.com/office/word/2010/wordprocessingShape" mc:Ignorable="w14 w15 w16se w16cid w16 w16cex w16sdtdh w16sdtfl w16du wp14">
+  <w:endnote w:type="separator" w:id="-1">
+    <w:p>
+      <w:pPr>
+        <w:spacing w:after="0" w:line="240" w:lineRule="auto"/>
+      </w:pPr>
+      <w:r>
+        <w:separator/>
+      </w:r>
+    </w:p>
+  </w:endnote>
+  <w:endnote w:type="continuationSeparator" w:id="0">
+    <w:p>
+      <w:pPr>
+        <w:spacing w:after="0" w:line="240" w:lineRule="auto"/>
+      </w:pPr>
+      <w:r>
+        <w:continuationSeparator/>
+      </w:r>
+    </w:p>
+  </w:endnote>
+</w:endnotes>
+</file>
+
+<file path=word/footer1.xml><?xml version="1.0" encoding="utf-8"?>
+<w:ftr xmlns:wpc="http://schemas.microsoft.com/office/word/2010/wordprocessingCanvas" xmlns:cx="http://schemas.microsoft.com/office/drawing/2014/chartex" xmlns:cx1="http://schemas.microsoft.com/office/drawing/2015/9/8/chartex" xmlns:cx2="http://schemas.microsoft.com/office/drawing/2015/10/21/chartex" xmlns:cx3="http://schemas.microsoft.com/office/drawing/2016/5/9/chartex" xmlns:cx4="http://schemas.microsoft.com/office/drawing/2016/5/10/chartex" xmlns:cx5="http://schemas.microsoft.com/office/drawing/2016/5/11/chartex" xmlns:cx6="http://schemas.microsoft.com/office/drawing/2016/5/12/chartex" xmlns:cx7="http://schemas.microsoft.com/office/drawing/2016/5/13/chartex" xmlns:cx8="http://schemas.microsoft.com/office/drawing/2016/5/14/chartex" xmlns:mc="http://schemas.openxmlformats.org/markup-compatibility/2006" xmlns:aink="http://schemas.microsoft.com/office/drawing/2016/ink" xmlns:am3d="http://schemas.microsoft.com/office/drawing/2017/model3d" xmlns:o="urn:schemas-microsoft-com:office:office" xmlns:oel="http://schemas.microsoft.com/office/2019/extlst" xmlns:r="http://schemas.openxmlformats.org/officeDocument/2006/relationships" xmlns:m="http://schemas.openxmlformats.org/officeDocument/2006/math" xmlns:v="urn:schemas-microsoft-com:vml" xmlns:wp14="http://schemas.microsoft.com/office/word/2010/wordprocessingDrawing" xmlns:wp="http://schemas.openxmlformats.org/drawingml/2006/wordprocessingDrawing" xmlns:w10="urn:schemas-microsoft-com:office:word" xmlns:w="http://schemas.openxmlformats.org/wordprocessingml/2006/main" xmlns:w14="http://schemas.microsoft.com/office/word/2010/wordml" xmlns:w15="http://schemas.microsoft.com/office/word/2012/wordml" xmlns:w16cex="http://schemas.microsoft.com/office/word/2018/wordml/cex" xmlns:w16cid="http://schemas.microsoft.com/office/word/2016/wordml/cid" xmlns:w16="http://schemas.microsoft.com/office/word/2018/wordml" xmlns:w16du="http://schemas.microsoft.com/office/word/2023/wordml/word16du" xmlns:w16sdtdh="http://schemas.microsoft.com/office/word/2020/wordml/sdtdatahash" xmlns:w16sdtfl="http://schemas.microsoft.com/office/word/2024/wordml/sdtformatlock" xmlns:w16se="http://schemas.microsoft.com/office/word/2015/wordml/symex" xmlns:wpg="http://schemas.microsoft.com/office/word/2010/wordprocessingGroup" xmlns:wpi="http://schemas.microsoft.com/office/word/2010/wordprocessingInk" xmlns:wne="http://schemas.microsoft.com/office/word/2006/wordml" xmlns:wps="http://schemas.microsoft.com/office/word/2010/wordprocessingShape" mc:Ignorable="w14 w15 w16se w16cid w16 w16cex w16sdtdh w16sdtfl w16du wp14">
+  <w:p>
+    <w:pPr>
+      <w:jc w:val="right"/>
+      <w:rPr>
+        <w:color w:val="BFBFBF" w:themeColor="background1" w:themeShade="BF"/>
+        <w:sz w:val="16"/>
+        <w:szCs w:val="16"/>
+      </w:rPr>
+    </w:pPr>
+    <w:r>
+      <w:rPr>
+        <w:color w:val="BFBFBF" w:themeColor="background1" w:themeShade="BF"/>
+        <w:sz w:val="16"/>
+        <w:szCs w:val="16"/>
+      </w:rPr>
+      <w:t>Copyright © Immersive Fusion LLC</w:t>
+    </w:r>
+  </w:p>
+</w:ftr>
+</file>
+
+<file path=word/footnotes.xml><?xml version="1.0" encoding="utf-8"?>
+<w:footnotes xmlns:wpc="http://schemas.microsoft.com/office/word/2010/wordprocessingCanvas" xmlns:cx="http://schemas.microsoft.com/office/drawing/2014/chartex" xmlns:cx1="http://schemas.microsoft.com/office/drawing/2015/9/8/chartex" xmlns:cx2="http://schemas.microsoft.com/office/drawing/2015/10/21/chartex" xmlns:cx3="http://schemas.microsoft.com/office/drawing/2016/5/9/chartex" xmlns:cx4="http://schemas.microsoft.com/office/drawing/2016/5/10/chartex" xmlns:cx5="http://schemas.microsoft.com/office/drawing/2016/5/11/chartex" xmlns:cx6="http://schemas.microsoft.com/office/drawing/2016/5/12/chartex" xmlns:cx7="http://schemas.microsoft.com/office/drawing/2016/5/13/chartex" xmlns:cx8="http://schemas.microsoft.com/office/drawing/2016/5/14/chartex" xmlns:mc="http://schemas.openxmlformats.org/markup-compatibility/2006" xmlns:aink="http://schemas.microsoft.com/office/drawing/2016/ink" xmlns:am3d="http://schemas.microsoft.com/office/drawing/2017/model3d" xmlns:o="urn:schemas-microsoft-com:office:office" xmlns:oel="http://schemas.microsoft.com/office/2019/extlst" xmlns:r="http://schemas.openxmlformats.org/officeDocument/2006/relationships" xmlns:m="http://schemas.openxmlformats.org/officeDocument/2006/math" xmlns:v="urn:schemas-microsoft-com:vml" xmlns:wp14="http://schemas.microsoft.com/office/word/2010/wordprocessingDrawing" xmlns:wp="http://schemas.openxmlformats.org/drawingml/2006/wordprocessingDrawing" xmlns:w10="urn:schemas-microsoft-com:office:word" xmlns:w="http://schemas.openxmlformats.org/wordprocessingml/2006/main" xmlns:w14="http://schemas.microsoft.com/office/word/2010/wordml" xmlns:w15="http://schemas.microsoft.com/office/word/2012/wordml" xmlns:w16cex="http://schemas.microsoft.com/office/word/2018/wordml/cex" xmlns:w16cid="http://schemas.microsoft.com/office/word/2016/wordml/cid" xmlns:w16="http://schemas.microsoft.com/office/word/2018/wordml" xmlns:w16du="http://schemas.microsoft.com/office/word/2023/wordml/word16du" xmlns:w16sdtdh="http://schemas.microsoft.com/office/word/2020/wordml/sdtdatahash" xmlns:w16sdtfl="http://schemas.microsoft.com/office/word/2024/wordml/sdtformatlock" xmlns:w16se="http://schemas.microsoft.com/office/word/2015/wordml/symex" xmlns:wpg="http://schemas.microsoft.com/office/word/2010/wordprocessingGroup" xmlns:wpi="http://schemas.microsoft.com/office/word/2010/wordprocessingInk" xmlns:wne="http://schemas.microsoft.com/office/word/2006/wordml" xmlns:wps="http://schemas.microsoft.com/office/word/2010/wordprocessingShape" mc:Ignorable="w14 w15 w16se w16cid w16 w16cex w16sdtdh w16sdtfl w16du wp14">
+  <w:footnote w:type="separator" w:id="-1">
+    <w:p>
+      <w:pPr>
+        <w:spacing w:after="0" w:line="240" w:lineRule="auto"/>
+      </w:pPr>
+      <w:r>
+        <w:separator/>
+      </w:r>
+    </w:p>
+  </w:footnote>
+  <w:footnote w:type="continuationSeparator" w:id="0">
+    <w:p>
+      <w:pPr>
+        <w:spacing w:after="0" w:line="240" w:lineRule="auto"/>
+      </w:pPr>
+      <w:r>
+        <w:continuationSeparator/>
+      </w:r>
+    </w:p>
+  </w:footnote>
+</w:footnotes>
 </file>
 
 <file path=word/numbering.xml><?xml version="1.0" encoding="utf-8"?>
@@ -8765,7 +9078,6 @@
     <w:next w:val="Normal"/>
     <w:link w:val="Heading2Char"/>
     <w:uiPriority w:val="9"/>
-    <w:semiHidden/>
     <w:unhideWhenUsed/>
     <w:qFormat/>
     <w:rsid w:val="00541B76"/>
@@ -8938,7 +9250,6 @@
   <w:style w:type="character" w:default="1" w:styleId="DefaultParagraphFont">
     <w:name w:val="Default Paragraph Font"/>
     <w:uiPriority w:val="1"/>
-    <w:semiHidden/>
     <w:unhideWhenUsed/>
   </w:style>
   <w:style w:type="table" w:default="1" w:styleId="TableNormal">
@@ -8980,7 +9291,6 @@
     <w:basedOn w:val="DefaultParagraphFont"/>
     <w:link w:val="Heading2"/>
     <w:uiPriority w:val="9"/>
-    <w:semiHidden/>
     <w:rsid w:val="00541B76"/>
     <w:rPr>
       <w:rFonts w:asciiTheme="majorHAnsi" w:eastAsiaTheme="majorEastAsia" w:hAnsiTheme="majorHAnsi" w:cstheme="majorBidi"/>
@@ -9273,6 +9583,58 @@
     <w:rPr>
       <w:color w:val="605E5C"/>
       <w:shd w:val="clear" w:color="auto" w:fill="E1DFDD"/>
+    </w:rPr>
+  </w:style>
+  <w:style w:type="paragraph" w:styleId="Header">
+    <w:name w:val="header"/>
+    <w:basedOn w:val="Normal"/>
+    <w:link w:val="HeaderChar"/>
+    <w:uiPriority w:val="99"/>
+    <w:unhideWhenUsed/>
+    <w:rsid w:val="00043FFE"/>
+    <w:pPr>
+      <w:tabs>
+        <w:tab w:val="center" w:pos="4680"/>
+        <w:tab w:val="right" w:pos="9360"/>
+      </w:tabs>
+      <w:spacing w:after="0" w:line="240" w:lineRule="auto"/>
+    </w:pPr>
+  </w:style>
+  <w:style w:type="character" w:customStyle="1" w:styleId="HeaderChar">
+    <w:name w:val="Header Char"/>
+    <w:basedOn w:val="DefaultParagraphFont"/>
+    <w:link w:val="Header"/>
+    <w:uiPriority w:val="99"/>
+    <w:rsid w:val="00043FFE"/>
+    <w:rPr>
+      <w:rFonts w:ascii="Comic Sans MS" w:hAnsi="Comic Sans MS"/>
+      <w:sz w:val="28"/>
+    </w:rPr>
+  </w:style>
+  <w:style w:type="paragraph" w:styleId="Footer">
+    <w:name w:val="footer"/>
+    <w:basedOn w:val="Normal"/>
+    <w:link w:val="FooterChar"/>
+    <w:uiPriority w:val="99"/>
+    <w:unhideWhenUsed/>
+    <w:rsid w:val="00043FFE"/>
+    <w:pPr>
+      <w:tabs>
+        <w:tab w:val="center" w:pos="4680"/>
+        <w:tab w:val="right" w:pos="9360"/>
+      </w:tabs>
+      <w:spacing w:after="0" w:line="240" w:lineRule="auto"/>
+    </w:pPr>
+  </w:style>
+  <w:style w:type="character" w:customStyle="1" w:styleId="FooterChar">
+    <w:name w:val="Footer Char"/>
+    <w:basedOn w:val="DefaultParagraphFont"/>
+    <w:link w:val="Footer"/>
+    <w:uiPriority w:val="99"/>
+    <w:rsid w:val="00043FFE"/>
+    <w:rPr>
+      <w:rFonts w:ascii="Comic Sans MS" w:hAnsi="Comic Sans MS"/>
+      <w:sz w:val="28"/>
     </w:rPr>
   </w:style>
 </w:styles>

</xml_diff>